<commit_message>
Tesis v2: anexos 3 (matriz) y 4 (ficha de campo) con celdas fusionadas
</commit_message>
<xml_diff>
--- a/docs/Proyecto_de_investigacion_HydroVision_UCV_corregido_v2.docx
+++ b/docs/Proyecto_de_investigacion_HydroVision_UCV_corregido_v2.docx
@@ -18175,22 +18175,1782 @@
     </w:p>
     <w:p>
       <w:pPr>
+        <w:pStyle w:val="Heading2"/>
         <w:spacing w:after="0" w:before="0" w:line="360" w:lineRule="auto"/>
         <w:jc w:val="both"/>
         <w:rPr/>
       </w:pPr>
       <w:r>
-        <w:rPr>
-          <w:rFonts w:ascii="Arial" w:cs="Arial" w:eastAsia="Arial" w:hAnsi="Arial"/>
-          <w:b w:val="0"/>
-          <w:bCs w:val="0"/>
-          <w:sz w:val="24"/>
-          <w:szCs w:val="24"/>
-          <w:rtl w:val="0"/>
-        </w:rPr>
-        <w:t>[Los anexos se incorporarán al finalizar el proyecto: matriz de operacionalización de variables (Anexo 3) y ficha de registro de campo (Anexo 4).]</w:t>
+        <w:t>Anexo 3. Matriz de operacionalización de variables</w:t>
       </w:r>
     </w:p>
+    <w:p>
+      <w:r>
+        <w:rPr>
+          <w:sz w:val="18"/>
+        </w:rPr>
+        <w:t>La matriz relaciona cada variable con su definición conceptual, su definición operacional, sus dimensiones, indicadores, unidad de medida e instrumento de recolección.</w:t>
+      </w:r>
+    </w:p>
+    <w:tbl>
+      <w:tblPr>
+        <w:tblW w:type="auto" w:w="0"/>
+        <w:tblLook w:firstColumn="1" w:firstRow="1" w:lastColumn="0" w:lastRow="0" w:noHBand="0" w:noVBand="1" w:val="04A0"/>
+        <w:tblBorders>
+          <w:top w:val="single" w:sz="4" w:space="0" w:color="666666"/>
+          <w:left w:val="single" w:sz="4" w:space="0" w:color="666666"/>
+          <w:bottom w:val="single" w:sz="4" w:space="0" w:color="666666"/>
+          <w:right w:val="single" w:sz="4" w:space="0" w:color="666666"/>
+          <w:insideH w:val="single" w:sz="4" w:space="0" w:color="666666"/>
+          <w:insideV w:val="single" w:sz="4" w:space="0" w:color="666666"/>
+        </w:tblBorders>
+      </w:tblPr>
+      <w:tblGrid>
+        <w:gridCol w:w="1290"/>
+        <w:gridCol w:w="1290"/>
+        <w:gridCol w:w="1290"/>
+        <w:gridCol w:w="1290"/>
+        <w:gridCol w:w="1290"/>
+        <w:gridCol w:w="1290"/>
+        <w:gridCol w:w="1290"/>
+      </w:tblGrid>
+      <w:tr>
+        <w:tc>
+          <w:tcPr>
+            <w:tcW w:type="dxa" w:w="1361"/>
+          </w:tcPr>
+          <w:p>
+            <w:r>
+              <w:rPr>
+                <w:b/>
+                <w:sz w:val="14"/>
+              </w:rPr>
+              <w:t>Variable</w:t>
+            </w:r>
+          </w:p>
+        </w:tc>
+        <w:tc>
+          <w:tcPr>
+            <w:tcW w:type="dxa" w:w="1701"/>
+          </w:tcPr>
+          <w:p>
+            <w:r>
+              <w:rPr>
+                <w:b/>
+                <w:sz w:val="14"/>
+              </w:rPr>
+              <w:t>Definición conceptual</w:t>
+            </w:r>
+          </w:p>
+        </w:tc>
+        <w:tc>
+          <w:tcPr>
+            <w:tcW w:type="dxa" w:w="1814"/>
+          </w:tcPr>
+          <w:p>
+            <w:r>
+              <w:rPr>
+                <w:b/>
+                <w:sz w:val="14"/>
+              </w:rPr>
+              <w:t>Definición operacional</w:t>
+            </w:r>
+          </w:p>
+        </w:tc>
+        <w:tc>
+          <w:tcPr>
+            <w:tcW w:type="dxa" w:w="1077"/>
+          </w:tcPr>
+          <w:p>
+            <w:r>
+              <w:rPr>
+                <w:b/>
+                <w:sz w:val="14"/>
+              </w:rPr>
+              <w:t>Dimensión</w:t>
+            </w:r>
+          </w:p>
+        </w:tc>
+        <w:tc>
+          <w:tcPr>
+            <w:tcW w:type="dxa" w:w="1701"/>
+          </w:tcPr>
+          <w:p>
+            <w:r>
+              <w:rPr>
+                <w:b/>
+                <w:sz w:val="14"/>
+              </w:rPr>
+              <w:t>Indicador</w:t>
+            </w:r>
+          </w:p>
+        </w:tc>
+        <w:tc>
+          <w:tcPr>
+            <w:tcW w:type="dxa" w:w="1077"/>
+          </w:tcPr>
+          <w:p>
+            <w:r>
+              <w:rPr>
+                <w:b/>
+                <w:sz w:val="14"/>
+              </w:rPr>
+              <w:t>Unidad / escala</w:t>
+            </w:r>
+          </w:p>
+        </w:tc>
+        <w:tc>
+          <w:tcPr>
+            <w:tcW w:type="dxa" w:w="1474"/>
+          </w:tcPr>
+          <w:p>
+            <w:r>
+              <w:rPr>
+                <w:b/>
+                <w:sz w:val="14"/>
+              </w:rPr>
+              <w:t>Instrumento</w:t>
+            </w:r>
+          </w:p>
+        </w:tc>
+      </w:tr>
+      <w:tr>
+        <w:tc>
+          <w:tcPr>
+            <w:tcW w:type="dxa" w:w="1361"/>
+            <w:vMerge w:val="restart"/>
+          </w:tcPr>
+          <w:p>
+            <w:r>
+              <w:rPr>
+                <w:sz w:val="14"/>
+              </w:rPr>
+              <w:t>Calidad del agua (dependiente)</w:t>
+            </w:r>
+          </w:p>
+        </w:tc>
+        <w:tc>
+          <w:tcPr>
+            <w:tcW w:type="dxa" w:w="1701"/>
+            <w:vMerge w:val="restart"/>
+          </w:tcPr>
+          <w:p>
+            <w:r>
+              <w:rPr>
+                <w:sz w:val="14"/>
+              </w:rPr>
+              <w:t>Conjunto de características fisicoquímicas y microbiológicas que determinan la aptitud del agua para un uso o su grado de alteración.</w:t>
+            </w:r>
+          </w:p>
+        </w:tc>
+        <w:tc>
+          <w:tcPr>
+            <w:tcW w:type="dxa" w:w="1814"/>
+            <w:vMerge w:val="restart"/>
+          </w:tcPr>
+          <w:p>
+            <w:r>
+              <w:rPr>
+                <w:sz w:val="14"/>
+              </w:rPr>
+              <w:t>Medición in situ o en laboratorio de nueve parámetros por punto de monitoreo y fecha, con método y unidad identificables.</w:t>
+            </w:r>
+          </w:p>
+        </w:tc>
+        <w:tc>
+          <w:tcPr>
+            <w:tcW w:type="dxa" w:w="1077"/>
+            <w:vMerge w:val="restart"/>
+          </w:tcPr>
+          <w:p>
+            <w:r>
+              <w:rPr>
+                <w:sz w:val="14"/>
+              </w:rPr>
+              <w:t>Fisicoquímica</w:t>
+            </w:r>
+          </w:p>
+        </w:tc>
+        <w:tc>
+          <w:tcPr>
+            <w:tcW w:type="dxa" w:w="1701"/>
+          </w:tcPr>
+          <w:p>
+            <w:r>
+              <w:rPr>
+                <w:sz w:val="14"/>
+              </w:rPr>
+              <w:t>Temperatura</w:t>
+            </w:r>
+          </w:p>
+        </w:tc>
+        <w:tc>
+          <w:tcPr>
+            <w:tcW w:type="dxa" w:w="1077"/>
+          </w:tcPr>
+          <w:p>
+            <w:r>
+              <w:rPr>
+                <w:sz w:val="14"/>
+              </w:rPr>
+              <w:t>°C</w:t>
+            </w:r>
+          </w:p>
+        </w:tc>
+        <w:tc>
+          <w:tcPr>
+            <w:tcW w:type="dxa" w:w="1474"/>
+          </w:tcPr>
+          <w:p>
+            <w:r>
+              <w:rPr>
+                <w:sz w:val="14"/>
+              </w:rPr>
+              <w:t>Ficha de campo / laboratorio</w:t>
+            </w:r>
+          </w:p>
+        </w:tc>
+      </w:tr>
+      <w:tr>
+        <w:tc>
+          <w:tcPr>
+            <w:tcW w:type="dxa" w:w="1361"/>
+            <w:vMerge/>
+          </w:tcPr>
+          <w:p/>
+        </w:tc>
+        <w:tc>
+          <w:tcPr>
+            <w:tcW w:type="dxa" w:w="1701"/>
+            <w:vMerge/>
+          </w:tcPr>
+          <w:p/>
+        </w:tc>
+        <w:tc>
+          <w:tcPr>
+            <w:tcW w:type="dxa" w:w="1814"/>
+            <w:vMerge/>
+          </w:tcPr>
+          <w:p/>
+        </w:tc>
+        <w:tc>
+          <w:tcPr>
+            <w:tcW w:type="dxa" w:w="1077"/>
+            <w:vMerge/>
+          </w:tcPr>
+          <w:p/>
+        </w:tc>
+        <w:tc>
+          <w:tcPr>
+            <w:tcW w:type="dxa" w:w="1701"/>
+          </w:tcPr>
+          <w:p>
+            <w:r>
+              <w:rPr>
+                <w:sz w:val="14"/>
+              </w:rPr>
+              <w:t>pH</w:t>
+            </w:r>
+          </w:p>
+        </w:tc>
+        <w:tc>
+          <w:tcPr>
+            <w:tcW w:type="dxa" w:w="1077"/>
+          </w:tcPr>
+          <w:p>
+            <w:r>
+              <w:rPr>
+                <w:sz w:val="14"/>
+              </w:rPr>
+              <w:t>unidad de pH</w:t>
+            </w:r>
+          </w:p>
+        </w:tc>
+        <w:tc>
+          <w:tcPr>
+            <w:tcW w:type="dxa" w:w="1474"/>
+          </w:tcPr>
+          <w:p>
+            <w:r>
+              <w:rPr>
+                <w:sz w:val="14"/>
+              </w:rPr>
+              <w:t>Ficha de campo / laboratorio</w:t>
+            </w:r>
+          </w:p>
+        </w:tc>
+      </w:tr>
+      <w:tr>
+        <w:tc>
+          <w:tcPr>
+            <w:tcW w:type="dxa" w:w="1361"/>
+            <w:vMerge/>
+          </w:tcPr>
+          <w:p/>
+        </w:tc>
+        <w:tc>
+          <w:tcPr>
+            <w:tcW w:type="dxa" w:w="1701"/>
+            <w:vMerge/>
+          </w:tcPr>
+          <w:p/>
+        </w:tc>
+        <w:tc>
+          <w:tcPr>
+            <w:tcW w:type="dxa" w:w="1814"/>
+            <w:vMerge/>
+          </w:tcPr>
+          <w:p/>
+        </w:tc>
+        <w:tc>
+          <w:tcPr>
+            <w:tcW w:type="dxa" w:w="1077"/>
+            <w:vMerge/>
+          </w:tcPr>
+          <w:p/>
+        </w:tc>
+        <w:tc>
+          <w:tcPr>
+            <w:tcW w:type="dxa" w:w="1701"/>
+          </w:tcPr>
+          <w:p>
+            <w:r>
+              <w:rPr>
+                <w:sz w:val="14"/>
+              </w:rPr>
+              <w:t>Conductividad eléctrica</w:t>
+            </w:r>
+          </w:p>
+        </w:tc>
+        <w:tc>
+          <w:tcPr>
+            <w:tcW w:type="dxa" w:w="1077"/>
+          </w:tcPr>
+          <w:p>
+            <w:r>
+              <w:rPr>
+                <w:sz w:val="14"/>
+              </w:rPr>
+              <w:t>µS/cm</w:t>
+            </w:r>
+          </w:p>
+        </w:tc>
+        <w:tc>
+          <w:tcPr>
+            <w:tcW w:type="dxa" w:w="1474"/>
+          </w:tcPr>
+          <w:p>
+            <w:r>
+              <w:rPr>
+                <w:sz w:val="14"/>
+              </w:rPr>
+              <w:t>Ficha de campo / laboratorio</w:t>
+            </w:r>
+          </w:p>
+        </w:tc>
+      </w:tr>
+      <w:tr>
+        <w:tc>
+          <w:tcPr>
+            <w:tcW w:type="dxa" w:w="1361"/>
+            <w:vMerge/>
+          </w:tcPr>
+          <w:p/>
+        </w:tc>
+        <w:tc>
+          <w:tcPr>
+            <w:tcW w:type="dxa" w:w="1701"/>
+            <w:vMerge/>
+          </w:tcPr>
+          <w:p/>
+        </w:tc>
+        <w:tc>
+          <w:tcPr>
+            <w:tcW w:type="dxa" w:w="1814"/>
+            <w:vMerge/>
+          </w:tcPr>
+          <w:p/>
+        </w:tc>
+        <w:tc>
+          <w:tcPr>
+            <w:tcW w:type="dxa" w:w="1077"/>
+            <w:vMerge/>
+          </w:tcPr>
+          <w:p/>
+        </w:tc>
+        <w:tc>
+          <w:tcPr>
+            <w:tcW w:type="dxa" w:w="1701"/>
+          </w:tcPr>
+          <w:p>
+            <w:r>
+              <w:rPr>
+                <w:sz w:val="14"/>
+              </w:rPr>
+              <w:t>Sólidos suspendidos totales</w:t>
+            </w:r>
+          </w:p>
+        </w:tc>
+        <w:tc>
+          <w:tcPr>
+            <w:tcW w:type="dxa" w:w="1077"/>
+          </w:tcPr>
+          <w:p>
+            <w:r>
+              <w:rPr>
+                <w:sz w:val="14"/>
+              </w:rPr>
+              <w:t>mg/L</w:t>
+            </w:r>
+          </w:p>
+        </w:tc>
+        <w:tc>
+          <w:tcPr>
+            <w:tcW w:type="dxa" w:w="1474"/>
+          </w:tcPr>
+          <w:p>
+            <w:r>
+              <w:rPr>
+                <w:sz w:val="14"/>
+              </w:rPr>
+              <w:t>Laboratorio (2540 D)</w:t>
+            </w:r>
+          </w:p>
+        </w:tc>
+      </w:tr>
+      <w:tr>
+        <w:tc>
+          <w:tcPr>
+            <w:tcW w:type="dxa" w:w="1361"/>
+            <w:vMerge/>
+          </w:tcPr>
+          <w:p/>
+        </w:tc>
+        <w:tc>
+          <w:tcPr>
+            <w:tcW w:type="dxa" w:w="1701"/>
+            <w:vMerge/>
+          </w:tcPr>
+          <w:p/>
+        </w:tc>
+        <w:tc>
+          <w:tcPr>
+            <w:tcW w:type="dxa" w:w="1814"/>
+            <w:vMerge/>
+          </w:tcPr>
+          <w:p/>
+        </w:tc>
+        <w:tc>
+          <w:tcPr>
+            <w:tcW w:type="dxa" w:w="1077"/>
+            <w:vMerge/>
+          </w:tcPr>
+          <w:p/>
+        </w:tc>
+        <w:tc>
+          <w:tcPr>
+            <w:tcW w:type="dxa" w:w="1701"/>
+          </w:tcPr>
+          <w:p>
+            <w:r>
+              <w:rPr>
+                <w:sz w:val="14"/>
+              </w:rPr>
+              <w:t>Demanda bioquímica de oxígeno (DBO5)</w:t>
+            </w:r>
+          </w:p>
+        </w:tc>
+        <w:tc>
+          <w:tcPr>
+            <w:tcW w:type="dxa" w:w="1077"/>
+          </w:tcPr>
+          <w:p>
+            <w:r>
+              <w:rPr>
+                <w:sz w:val="14"/>
+              </w:rPr>
+              <w:t>mg/L</w:t>
+            </w:r>
+          </w:p>
+        </w:tc>
+        <w:tc>
+          <w:tcPr>
+            <w:tcW w:type="dxa" w:w="1474"/>
+          </w:tcPr>
+          <w:p>
+            <w:r>
+              <w:rPr>
+                <w:sz w:val="14"/>
+              </w:rPr>
+              <w:t>Laboratorio</w:t>
+            </w:r>
+          </w:p>
+        </w:tc>
+      </w:tr>
+      <w:tr>
+        <w:tc>
+          <w:tcPr>
+            <w:tcW w:type="dxa" w:w="1361"/>
+            <w:vMerge/>
+          </w:tcPr>
+          <w:p/>
+        </w:tc>
+        <w:tc>
+          <w:tcPr>
+            <w:tcW w:type="dxa" w:w="1701"/>
+            <w:vMerge/>
+          </w:tcPr>
+          <w:p/>
+        </w:tc>
+        <w:tc>
+          <w:tcPr>
+            <w:tcW w:type="dxa" w:w="1814"/>
+            <w:vMerge/>
+          </w:tcPr>
+          <w:p/>
+        </w:tc>
+        <w:tc>
+          <w:tcPr>
+            <w:tcW w:type="dxa" w:w="1077"/>
+            <w:vMerge/>
+          </w:tcPr>
+          <w:p/>
+        </w:tc>
+        <w:tc>
+          <w:tcPr>
+            <w:tcW w:type="dxa" w:w="1701"/>
+          </w:tcPr>
+          <w:p>
+            <w:r>
+              <w:rPr>
+                <w:sz w:val="14"/>
+              </w:rPr>
+              <w:t>Demanda química de oxígeno (DQO)</w:t>
+            </w:r>
+          </w:p>
+        </w:tc>
+        <w:tc>
+          <w:tcPr>
+            <w:tcW w:type="dxa" w:w="1077"/>
+          </w:tcPr>
+          <w:p>
+            <w:r>
+              <w:rPr>
+                <w:sz w:val="14"/>
+              </w:rPr>
+              <w:t>mg/L</w:t>
+            </w:r>
+          </w:p>
+        </w:tc>
+        <w:tc>
+          <w:tcPr>
+            <w:tcW w:type="dxa" w:w="1474"/>
+          </w:tcPr>
+          <w:p>
+            <w:r>
+              <w:rPr>
+                <w:sz w:val="14"/>
+              </w:rPr>
+              <w:t>Laboratorio</w:t>
+            </w:r>
+          </w:p>
+        </w:tc>
+      </w:tr>
+      <w:tr>
+        <w:tc>
+          <w:tcPr>
+            <w:tcW w:type="dxa" w:w="1361"/>
+            <w:vMerge/>
+          </w:tcPr>
+          <w:p/>
+        </w:tc>
+        <w:tc>
+          <w:tcPr>
+            <w:tcW w:type="dxa" w:w="1701"/>
+            <w:vMerge/>
+          </w:tcPr>
+          <w:p/>
+        </w:tc>
+        <w:tc>
+          <w:tcPr>
+            <w:tcW w:type="dxa" w:w="1814"/>
+            <w:vMerge/>
+          </w:tcPr>
+          <w:p/>
+        </w:tc>
+        <w:tc>
+          <w:tcPr>
+            <w:tcW w:type="dxa" w:w="1077"/>
+            <w:vMerge/>
+          </w:tcPr>
+          <w:p/>
+        </w:tc>
+        <w:tc>
+          <w:tcPr>
+            <w:tcW w:type="dxa" w:w="1701"/>
+          </w:tcPr>
+          <w:p>
+            <w:r>
+              <w:rPr>
+                <w:sz w:val="14"/>
+              </w:rPr>
+              <w:t>Nitratos</w:t>
+            </w:r>
+          </w:p>
+        </w:tc>
+        <w:tc>
+          <w:tcPr>
+            <w:tcW w:type="dxa" w:w="1077"/>
+          </w:tcPr>
+          <w:p>
+            <w:r>
+              <w:rPr>
+                <w:sz w:val="14"/>
+              </w:rPr>
+              <w:t>mg/L</w:t>
+            </w:r>
+          </w:p>
+        </w:tc>
+        <w:tc>
+          <w:tcPr>
+            <w:tcW w:type="dxa" w:w="1474"/>
+          </w:tcPr>
+          <w:p>
+            <w:r>
+              <w:rPr>
+                <w:sz w:val="14"/>
+              </w:rPr>
+              <w:t>Laboratorio</w:t>
+            </w:r>
+          </w:p>
+        </w:tc>
+      </w:tr>
+      <w:tr>
+        <w:tc>
+          <w:tcPr>
+            <w:tcW w:type="dxa" w:w="1361"/>
+            <w:vMerge/>
+          </w:tcPr>
+          <w:p/>
+        </w:tc>
+        <w:tc>
+          <w:tcPr>
+            <w:tcW w:type="dxa" w:w="1701"/>
+            <w:vMerge/>
+          </w:tcPr>
+          <w:p/>
+        </w:tc>
+        <w:tc>
+          <w:tcPr>
+            <w:tcW w:type="dxa" w:w="1814"/>
+            <w:vMerge/>
+          </w:tcPr>
+          <w:p/>
+        </w:tc>
+        <w:tc>
+          <w:tcPr>
+            <w:tcW w:type="dxa" w:w="1077"/>
+            <w:vMerge/>
+          </w:tcPr>
+          <w:p/>
+        </w:tc>
+        <w:tc>
+          <w:tcPr>
+            <w:tcW w:type="dxa" w:w="1701"/>
+          </w:tcPr>
+          <w:p>
+            <w:r>
+              <w:rPr>
+                <w:sz w:val="14"/>
+              </w:rPr>
+              <w:t>Fosfatos</w:t>
+            </w:r>
+          </w:p>
+        </w:tc>
+        <w:tc>
+          <w:tcPr>
+            <w:tcW w:type="dxa" w:w="1077"/>
+          </w:tcPr>
+          <w:p>
+            <w:r>
+              <w:rPr>
+                <w:sz w:val="14"/>
+              </w:rPr>
+              <w:t>mg/L</w:t>
+            </w:r>
+          </w:p>
+        </w:tc>
+        <w:tc>
+          <w:tcPr>
+            <w:tcW w:type="dxa" w:w="1474"/>
+          </w:tcPr>
+          <w:p>
+            <w:r>
+              <w:rPr>
+                <w:sz w:val="14"/>
+              </w:rPr>
+              <w:t>Laboratorio</w:t>
+            </w:r>
+          </w:p>
+        </w:tc>
+      </w:tr>
+      <w:tr>
+        <w:tc>
+          <w:tcPr>
+            <w:tcW w:type="dxa" w:w="1361"/>
+            <w:vMerge/>
+          </w:tcPr>
+          <w:p/>
+        </w:tc>
+        <w:tc>
+          <w:tcPr>
+            <w:tcW w:type="dxa" w:w="1701"/>
+            <w:vMerge/>
+          </w:tcPr>
+          <w:p/>
+        </w:tc>
+        <w:tc>
+          <w:tcPr>
+            <w:tcW w:type="dxa" w:w="1814"/>
+            <w:vMerge/>
+          </w:tcPr>
+          <w:p/>
+        </w:tc>
+        <w:tc>
+          <w:tcPr>
+            <w:tcW w:type="dxa" w:w="1077"/>
+            <w:vMerge/>
+          </w:tcPr>
+          <w:p/>
+        </w:tc>
+        <w:tc>
+          <w:tcPr>
+            <w:tcW w:type="dxa" w:w="1701"/>
+          </w:tcPr>
+          <w:p>
+            <w:r>
+              <w:rPr>
+                <w:sz w:val="14"/>
+              </w:rPr>
+              <w:t>Aceites y grasas</w:t>
+            </w:r>
+          </w:p>
+        </w:tc>
+        <w:tc>
+          <w:tcPr>
+            <w:tcW w:type="dxa" w:w="1077"/>
+          </w:tcPr>
+          <w:p>
+            <w:r>
+              <w:rPr>
+                <w:sz w:val="14"/>
+              </w:rPr>
+              <w:t>mg/L</w:t>
+            </w:r>
+          </w:p>
+        </w:tc>
+        <w:tc>
+          <w:tcPr>
+            <w:tcW w:type="dxa" w:w="1474"/>
+          </w:tcPr>
+          <w:p>
+            <w:r>
+              <w:rPr>
+                <w:sz w:val="14"/>
+              </w:rPr>
+              <w:t>Laboratorio</w:t>
+            </w:r>
+          </w:p>
+        </w:tc>
+      </w:tr>
+      <w:tr>
+        <w:tc>
+          <w:tcPr>
+            <w:tcW w:type="dxa" w:w="1361"/>
+            <w:vMerge/>
+          </w:tcPr>
+          <w:p/>
+        </w:tc>
+        <w:tc>
+          <w:tcPr>
+            <w:tcW w:type="dxa" w:w="1701"/>
+            <w:vMerge/>
+          </w:tcPr>
+          <w:p/>
+        </w:tc>
+        <w:tc>
+          <w:tcPr>
+            <w:tcW w:type="dxa" w:w="1814"/>
+            <w:vMerge/>
+          </w:tcPr>
+          <w:p/>
+        </w:tc>
+        <w:tc>
+          <w:tcPr>
+            <w:tcW w:type="dxa" w:w="1077"/>
+            <w:vMerge w:val="restart"/>
+          </w:tcPr>
+          <w:p>
+            <w:r>
+              <w:rPr>
+                <w:sz w:val="14"/>
+              </w:rPr>
+              <w:t>Microbiológica</w:t>
+            </w:r>
+          </w:p>
+        </w:tc>
+        <w:tc>
+          <w:tcPr>
+            <w:tcW w:type="dxa" w:w="1701"/>
+          </w:tcPr>
+          <w:p>
+            <w:r>
+              <w:rPr>
+                <w:sz w:val="14"/>
+              </w:rPr>
+              <w:t>Coliformes totales</w:t>
+            </w:r>
+          </w:p>
+        </w:tc>
+        <w:tc>
+          <w:tcPr>
+            <w:tcW w:type="dxa" w:w="1077"/>
+          </w:tcPr>
+          <w:p>
+            <w:r>
+              <w:rPr>
+                <w:sz w:val="14"/>
+              </w:rPr>
+              <w:t>NMP/100 mL</w:t>
+            </w:r>
+          </w:p>
+        </w:tc>
+        <w:tc>
+          <w:tcPr>
+            <w:tcW w:type="dxa" w:w="1474"/>
+          </w:tcPr>
+          <w:p>
+            <w:r>
+              <w:rPr>
+                <w:sz w:val="14"/>
+              </w:rPr>
+              <w:t>Laboratorio</w:t>
+            </w:r>
+          </w:p>
+        </w:tc>
+      </w:tr>
+      <w:tr>
+        <w:tc>
+          <w:tcPr>
+            <w:tcW w:type="dxa" w:w="1361"/>
+            <w:vMerge/>
+          </w:tcPr>
+          <w:p/>
+        </w:tc>
+        <w:tc>
+          <w:tcPr>
+            <w:tcW w:type="dxa" w:w="1701"/>
+            <w:vMerge/>
+          </w:tcPr>
+          <w:p/>
+        </w:tc>
+        <w:tc>
+          <w:tcPr>
+            <w:tcW w:type="dxa" w:w="1814"/>
+            <w:vMerge/>
+          </w:tcPr>
+          <w:p/>
+        </w:tc>
+        <w:tc>
+          <w:tcPr>
+            <w:tcW w:type="dxa" w:w="1077"/>
+            <w:vMerge/>
+          </w:tcPr>
+          <w:p/>
+        </w:tc>
+        <w:tc>
+          <w:tcPr>
+            <w:tcW w:type="dxa" w:w="1701"/>
+          </w:tcPr>
+          <w:p>
+            <w:r>
+              <w:rPr>
+                <w:sz w:val="14"/>
+              </w:rPr>
+              <w:t>Coliformes termotolerantes</w:t>
+            </w:r>
+          </w:p>
+        </w:tc>
+        <w:tc>
+          <w:tcPr>
+            <w:tcW w:type="dxa" w:w="1077"/>
+          </w:tcPr>
+          <w:p>
+            <w:r>
+              <w:rPr>
+                <w:sz w:val="14"/>
+              </w:rPr>
+              <w:t>NMP/100 mL</w:t>
+            </w:r>
+          </w:p>
+        </w:tc>
+        <w:tc>
+          <w:tcPr>
+            <w:tcW w:type="dxa" w:w="1474"/>
+          </w:tcPr>
+          <w:p>
+            <w:r>
+              <w:rPr>
+                <w:sz w:val="14"/>
+              </w:rPr>
+              <w:t>Laboratorio</w:t>
+            </w:r>
+          </w:p>
+        </w:tc>
+      </w:tr>
+      <w:tr>
+        <w:tc>
+          <w:tcPr>
+            <w:tcW w:type="dxa" w:w="1361"/>
+            <w:vMerge w:val="restart"/>
+          </w:tcPr>
+          <w:p>
+            <w:r>
+              <w:rPr>
+                <w:sz w:val="14"/>
+              </w:rPr>
+              <w:t>Información espectral y fotográfica (independiente)</w:t>
+            </w:r>
+          </w:p>
+        </w:tc>
+        <w:tc>
+          <w:tcPr>
+            <w:tcW w:type="dxa" w:w="1701"/>
+            <w:vMerge w:val="restart"/>
+          </w:tcPr>
+          <w:p>
+            <w:r>
+              <w:rPr>
+                <w:sz w:val="14"/>
+              </w:rPr>
+              <w:t>Reflectancia del agua medida por un sensor remoto y reflectancia estimada a partir de fotografías de teléfono inteligente.</w:t>
+            </w:r>
+          </w:p>
+        </w:tc>
+        <w:tc>
+          <w:tcPr>
+            <w:tcW w:type="dxa" w:w="1814"/>
+            <w:vMerge w:val="restart"/>
+          </w:tcPr>
+          <w:p>
+            <w:r>
+              <w:rPr>
+                <w:sz w:val="14"/>
+              </w:rPr>
+              <w:t>Reflectancia e índices derivados de imágenes Sentinel-2 L2A y de fotografías RGB, emparejados con la observación de campo.</w:t>
+            </w:r>
+          </w:p>
+        </w:tc>
+        <w:tc>
+          <w:tcPr>
+            <w:tcW w:type="dxa" w:w="1077"/>
+            <w:vMerge w:val="restart"/>
+          </w:tcPr>
+          <w:p>
+            <w:r>
+              <w:rPr>
+                <w:sz w:val="14"/>
+              </w:rPr>
+              <w:t>Espectral</w:t>
+            </w:r>
+          </w:p>
+        </w:tc>
+        <w:tc>
+          <w:tcPr>
+            <w:tcW w:type="dxa" w:w="1701"/>
+          </w:tcPr>
+          <w:p>
+            <w:r>
+              <w:rPr>
+                <w:sz w:val="14"/>
+              </w:rPr>
+              <w:t>Reflectancia B02–B12</w:t>
+            </w:r>
+          </w:p>
+        </w:tc>
+        <w:tc>
+          <w:tcPr>
+            <w:tcW w:type="dxa" w:w="1077"/>
+          </w:tcPr>
+          <w:p>
+            <w:r>
+              <w:rPr>
+                <w:sz w:val="14"/>
+              </w:rPr>
+              <w:t>adimensional</w:t>
+            </w:r>
+          </w:p>
+        </w:tc>
+        <w:tc>
+          <w:tcPr>
+            <w:tcW w:type="dxa" w:w="1474"/>
+          </w:tcPr>
+          <w:p>
+            <w:r>
+              <w:rPr>
+                <w:sz w:val="14"/>
+              </w:rPr>
+              <w:t>Planetary Computer / HydroVision</w:t>
+            </w:r>
+          </w:p>
+        </w:tc>
+      </w:tr>
+      <w:tr>
+        <w:tc>
+          <w:tcPr>
+            <w:tcW w:type="dxa" w:w="1361"/>
+            <w:vMerge/>
+          </w:tcPr>
+          <w:p/>
+        </w:tc>
+        <w:tc>
+          <w:tcPr>
+            <w:tcW w:type="dxa" w:w="1701"/>
+            <w:vMerge/>
+          </w:tcPr>
+          <w:p/>
+        </w:tc>
+        <w:tc>
+          <w:tcPr>
+            <w:tcW w:type="dxa" w:w="1814"/>
+            <w:vMerge/>
+          </w:tcPr>
+          <w:p/>
+        </w:tc>
+        <w:tc>
+          <w:tcPr>
+            <w:tcW w:type="dxa" w:w="1077"/>
+            <w:vMerge/>
+          </w:tcPr>
+          <w:p/>
+        </w:tc>
+        <w:tc>
+          <w:tcPr>
+            <w:tcW w:type="dxa" w:w="1701"/>
+          </w:tcPr>
+          <w:p>
+            <w:r>
+              <w:rPr>
+                <w:sz w:val="14"/>
+              </w:rPr>
+              <w:t>Índices NDWI, MNDWI, NDTI, NDCI, NDVI</w:t>
+            </w:r>
+          </w:p>
+        </w:tc>
+        <w:tc>
+          <w:tcPr>
+            <w:tcW w:type="dxa" w:w="1077"/>
+          </w:tcPr>
+          <w:p>
+            <w:r>
+              <w:rPr>
+                <w:sz w:val="14"/>
+              </w:rPr>
+              <w:t>adimensional</w:t>
+            </w:r>
+          </w:p>
+        </w:tc>
+        <w:tc>
+          <w:tcPr>
+            <w:tcW w:type="dxa" w:w="1474"/>
+          </w:tcPr>
+          <w:p>
+            <w:r>
+              <w:rPr>
+                <w:sz w:val="14"/>
+              </w:rPr>
+              <w:t>HydroVision</w:t>
+            </w:r>
+          </w:p>
+        </w:tc>
+      </w:tr>
+      <w:tr>
+        <w:tc>
+          <w:tcPr>
+            <w:tcW w:type="dxa" w:w="1361"/>
+            <w:vMerge/>
+          </w:tcPr>
+          <w:p/>
+        </w:tc>
+        <w:tc>
+          <w:tcPr>
+            <w:tcW w:type="dxa" w:w="1701"/>
+            <w:vMerge/>
+          </w:tcPr>
+          <w:p/>
+        </w:tc>
+        <w:tc>
+          <w:tcPr>
+            <w:tcW w:type="dxa" w:w="1814"/>
+            <w:vMerge/>
+          </w:tcPr>
+          <w:p/>
+        </w:tc>
+        <w:tc>
+          <w:tcPr>
+            <w:tcW w:type="dxa" w:w="1077"/>
+          </w:tcPr>
+          <w:p>
+            <w:r>
+              <w:rPr>
+                <w:sz w:val="14"/>
+              </w:rPr>
+              <w:t>Fotográfica</w:t>
+            </w:r>
+          </w:p>
+        </w:tc>
+        <w:tc>
+          <w:tcPr>
+            <w:tcW w:type="dxa" w:w="1701"/>
+          </w:tcPr>
+          <w:p>
+            <w:r>
+              <w:rPr>
+                <w:sz w:val="14"/>
+              </w:rPr>
+              <w:t>Reflectancia R, G, B</w:t>
+            </w:r>
+          </w:p>
+        </w:tc>
+        <w:tc>
+          <w:tcPr>
+            <w:tcW w:type="dxa" w:w="1077"/>
+          </w:tcPr>
+          <w:p>
+            <w:r>
+              <w:rPr>
+                <w:sz w:val="14"/>
+              </w:rPr>
+              <w:t>0–255 y adimensional</w:t>
+            </w:r>
+          </w:p>
+        </w:tc>
+        <w:tc>
+          <w:tcPr>
+            <w:tcW w:type="dxa" w:w="1474"/>
+          </w:tcPr>
+          <w:p>
+            <w:r>
+              <w:rPr>
+                <w:sz w:val="14"/>
+              </w:rPr>
+              <w:t>HydroColor / HydroVision</w:t>
+            </w:r>
+          </w:p>
+        </w:tc>
+      </w:tr>
+    </w:tbl>
+    <w:p>
+      <w:r>
+        <w:br w:type="page"/>
+      </w:r>
+    </w:p>
+    <w:p>
+      <w:pPr>
+        <w:pStyle w:val="Heading2"/>
+      </w:pPr>
+      <w:r>
+        <w:t>Anexo 4. Ficha de registro de campo</w:t>
+      </w:r>
+    </w:p>
+    <w:p>
+      <w:r>
+        <w:rPr>
+          <w:sz w:val="18"/>
+        </w:rPr>
+        <w:t>Ficha para registrar cada visita de muestreo. Se completa en campo y se complementa con los resultados de laboratorio.</w:t>
+      </w:r>
+    </w:p>
+    <w:tbl>
+      <w:tblPr>
+        <w:tblW w:type="auto" w:w="0"/>
+        <w:tblLook w:firstColumn="1" w:firstRow="1" w:lastColumn="0" w:lastRow="0" w:noHBand="0" w:noVBand="1" w:val="04A0"/>
+        <w:tblBorders>
+          <w:top w:val="single" w:sz="4" w:space="0" w:color="666666"/>
+          <w:left w:val="single" w:sz="4" w:space="0" w:color="666666"/>
+          <w:bottom w:val="single" w:sz="4" w:space="0" w:color="666666"/>
+          <w:right w:val="single" w:sz="4" w:space="0" w:color="666666"/>
+          <w:insideH w:val="single" w:sz="4" w:space="0" w:color="666666"/>
+          <w:insideV w:val="single" w:sz="4" w:space="0" w:color="666666"/>
+        </w:tblBorders>
+      </w:tblPr>
+      <w:tblGrid>
+        <w:gridCol w:w="4514"/>
+        <w:gridCol w:w="4514"/>
+      </w:tblGrid>
+      <w:tr>
+        <w:tc>
+          <w:tcPr>
+            <w:tcW w:type="dxa" w:w="3969"/>
+          </w:tcPr>
+          <w:p>
+            <w:r>
+              <w:rPr>
+                <w:b/>
+                <w:sz w:val="16"/>
+              </w:rPr>
+              <w:t>Campo</w:t>
+            </w:r>
+          </w:p>
+        </w:tc>
+        <w:tc>
+          <w:tcPr>
+            <w:tcW w:type="dxa" w:w="5669"/>
+          </w:tcPr>
+          <w:p>
+            <w:r>
+              <w:rPr>
+                <w:b/>
+                <w:sz w:val="16"/>
+              </w:rPr>
+              <w:t>Registro / unidad</w:t>
+            </w:r>
+          </w:p>
+        </w:tc>
+      </w:tr>
+      <w:tr>
+        <w:tc>
+          <w:tcPr>
+            <w:tcW w:type="dxa" w:w="3969"/>
+          </w:tcPr>
+          <w:p>
+            <w:r>
+              <w:rPr>
+                <w:sz w:val="16"/>
+              </w:rPr>
+              <w:t>Fecha de muestreo</w:t>
+            </w:r>
+          </w:p>
+        </w:tc>
+        <w:tc>
+          <w:tcPr>
+            <w:tcW w:type="dxa" w:w="5669"/>
+          </w:tcPr>
+          <w:p>
+            <w:r>
+              <w:rPr>
+                <w:sz w:val="16"/>
+              </w:rPr>
+              <w:t>dd/mm/aaaa</w:t>
+            </w:r>
+          </w:p>
+        </w:tc>
+      </w:tr>
+      <w:tr>
+        <w:tc>
+          <w:tcPr>
+            <w:tcW w:type="dxa" w:w="3969"/>
+          </w:tcPr>
+          <w:p>
+            <w:r>
+              <w:rPr>
+                <w:sz w:val="16"/>
+              </w:rPr>
+              <w:t>Hora</w:t>
+            </w:r>
+          </w:p>
+        </w:tc>
+        <w:tc>
+          <w:tcPr>
+            <w:tcW w:type="dxa" w:w="5669"/>
+          </w:tcPr>
+          <w:p>
+            <w:r>
+              <w:rPr>
+                <w:sz w:val="16"/>
+              </w:rPr>
+              <w:t>hh:mm</w:t>
+            </w:r>
+          </w:p>
+        </w:tc>
+      </w:tr>
+      <w:tr>
+        <w:tc>
+          <w:tcPr>
+            <w:tcW w:type="dxa" w:w="3969"/>
+          </w:tcPr>
+          <w:p>
+            <w:r>
+              <w:rPr>
+                <w:sz w:val="16"/>
+              </w:rPr>
+              <w:t>Código del punto</w:t>
+            </w:r>
+          </w:p>
+        </w:tc>
+        <w:tc>
+          <w:tcPr>
+            <w:tcW w:type="dxa" w:w="5669"/>
+          </w:tcPr>
+          <w:p>
+            <w:r>
+              <w:rPr>
+                <w:sz w:val="16"/>
+              </w:rPr>
+              <w:t>P1–P10</w:t>
+            </w:r>
+          </w:p>
+        </w:tc>
+      </w:tr>
+      <w:tr>
+        <w:tc>
+          <w:tcPr>
+            <w:tcW w:type="dxa" w:w="3969"/>
+          </w:tcPr>
+          <w:p>
+            <w:r>
+              <w:rPr>
+                <w:sz w:val="16"/>
+              </w:rPr>
+              <w:t>Coordenadas</w:t>
+            </w:r>
+          </w:p>
+        </w:tc>
+        <w:tc>
+          <w:tcPr>
+            <w:tcW w:type="dxa" w:w="5669"/>
+          </w:tcPr>
+          <w:p>
+            <w:r>
+              <w:rPr>
+                <w:sz w:val="16"/>
+              </w:rPr>
+              <w:t>latitud, longitud (WGS84)</w:t>
+            </w:r>
+          </w:p>
+        </w:tc>
+      </w:tr>
+      <w:tr>
+        <w:tc>
+          <w:tcPr>
+            <w:tcW w:type="dxa" w:w="3969"/>
+          </w:tcPr>
+          <w:p>
+            <w:r>
+              <w:rPr>
+                <w:sz w:val="16"/>
+              </w:rPr>
+              <w:t>Matriz de agua</w:t>
+            </w:r>
+          </w:p>
+        </w:tc>
+        <w:tc>
+          <w:tcPr>
+            <w:tcW w:type="dxa" w:w="5669"/>
+          </w:tcPr>
+          <w:p>
+            <w:r>
+              <w:rPr>
+                <w:sz w:val="16"/>
+              </w:rPr>
+              <w:t>cauce / efluente / zona marina</w:t>
+            </w:r>
+          </w:p>
+        </w:tc>
+      </w:tr>
+      <w:tr>
+        <w:tc>
+          <w:tcPr>
+            <w:tcW w:type="dxa" w:w="3969"/>
+          </w:tcPr>
+          <w:p>
+            <w:r>
+              <w:rPr>
+                <w:sz w:val="16"/>
+              </w:rPr>
+              <w:t>Condiciones climáticas</w:t>
+            </w:r>
+          </w:p>
+        </w:tc>
+        <w:tc>
+          <w:tcPr>
+            <w:tcW w:type="dxa" w:w="5669"/>
+          </w:tcPr>
+          <w:p>
+            <w:r>
+              <w:rPr>
+                <w:sz w:val="16"/>
+              </w:rPr>
+              <w:t>texto</w:t>
+            </w:r>
+          </w:p>
+        </w:tc>
+      </w:tr>
+      <w:tr>
+        <w:tc>
+          <w:tcPr>
+            <w:tcW w:type="dxa" w:w="3969"/>
+          </w:tcPr>
+          <w:p>
+            <w:r>
+              <w:rPr>
+                <w:sz w:val="16"/>
+              </w:rPr>
+              <w:t>Temperatura</w:t>
+            </w:r>
+          </w:p>
+        </w:tc>
+        <w:tc>
+          <w:tcPr>
+            <w:tcW w:type="dxa" w:w="5669"/>
+          </w:tcPr>
+          <w:p>
+            <w:r>
+              <w:rPr>
+                <w:sz w:val="16"/>
+              </w:rPr>
+              <w:t>°C</w:t>
+            </w:r>
+          </w:p>
+        </w:tc>
+      </w:tr>
+      <w:tr>
+        <w:tc>
+          <w:tcPr>
+            <w:tcW w:type="dxa" w:w="3969"/>
+          </w:tcPr>
+          <w:p>
+            <w:r>
+              <w:rPr>
+                <w:sz w:val="16"/>
+              </w:rPr>
+              <w:t>pH</w:t>
+            </w:r>
+          </w:p>
+        </w:tc>
+        <w:tc>
+          <w:tcPr>
+            <w:tcW w:type="dxa" w:w="5669"/>
+          </w:tcPr>
+          <w:p>
+            <w:r>
+              <w:rPr>
+                <w:sz w:val="16"/>
+              </w:rPr>
+              <w:t>unidad de pH</w:t>
+            </w:r>
+          </w:p>
+        </w:tc>
+      </w:tr>
+      <w:tr>
+        <w:tc>
+          <w:tcPr>
+            <w:tcW w:type="dxa" w:w="3969"/>
+          </w:tcPr>
+          <w:p>
+            <w:r>
+              <w:rPr>
+                <w:sz w:val="16"/>
+              </w:rPr>
+              <w:t>Conductividad eléctrica</w:t>
+            </w:r>
+          </w:p>
+        </w:tc>
+        <w:tc>
+          <w:tcPr>
+            <w:tcW w:type="dxa" w:w="5669"/>
+          </w:tcPr>
+          <w:p>
+            <w:r>
+              <w:rPr>
+                <w:sz w:val="16"/>
+              </w:rPr>
+              <w:t>µS/cm</w:t>
+            </w:r>
+          </w:p>
+        </w:tc>
+      </w:tr>
+      <w:tr>
+        <w:tc>
+          <w:tcPr>
+            <w:tcW w:type="dxa" w:w="3969"/>
+          </w:tcPr>
+          <w:p>
+            <w:r>
+              <w:rPr>
+                <w:sz w:val="16"/>
+              </w:rPr>
+              <w:t>Sólidos suspendidos totales</w:t>
+            </w:r>
+          </w:p>
+        </w:tc>
+        <w:tc>
+          <w:tcPr>
+            <w:tcW w:type="dxa" w:w="5669"/>
+          </w:tcPr>
+          <w:p>
+            <w:r>
+              <w:rPr>
+                <w:sz w:val="16"/>
+              </w:rPr>
+              <w:t>mg/L</w:t>
+            </w:r>
+          </w:p>
+        </w:tc>
+      </w:tr>
+      <w:tr>
+        <w:tc>
+          <w:tcPr>
+            <w:tcW w:type="dxa" w:w="3969"/>
+          </w:tcPr>
+          <w:p>
+            <w:r>
+              <w:rPr>
+                <w:sz w:val="16"/>
+              </w:rPr>
+              <w:t>Demanda bioquímica de oxígeno (DBO5)</w:t>
+            </w:r>
+          </w:p>
+        </w:tc>
+        <w:tc>
+          <w:tcPr>
+            <w:tcW w:type="dxa" w:w="5669"/>
+          </w:tcPr>
+          <w:p>
+            <w:r>
+              <w:rPr>
+                <w:sz w:val="16"/>
+              </w:rPr>
+              <w:t>mg/L</w:t>
+            </w:r>
+          </w:p>
+        </w:tc>
+      </w:tr>
+      <w:tr>
+        <w:tc>
+          <w:tcPr>
+            <w:tcW w:type="dxa" w:w="3969"/>
+          </w:tcPr>
+          <w:p>
+            <w:r>
+              <w:rPr>
+                <w:sz w:val="16"/>
+              </w:rPr>
+              <w:t>Demanda química de oxígeno (DQO)</w:t>
+            </w:r>
+          </w:p>
+        </w:tc>
+        <w:tc>
+          <w:tcPr>
+            <w:tcW w:type="dxa" w:w="5669"/>
+          </w:tcPr>
+          <w:p>
+            <w:r>
+              <w:rPr>
+                <w:sz w:val="16"/>
+              </w:rPr>
+              <w:t>mg/L</w:t>
+            </w:r>
+          </w:p>
+        </w:tc>
+      </w:tr>
+      <w:tr>
+        <w:tc>
+          <w:tcPr>
+            <w:tcW w:type="dxa" w:w="3969"/>
+          </w:tcPr>
+          <w:p>
+            <w:r>
+              <w:rPr>
+                <w:sz w:val="16"/>
+              </w:rPr>
+              <w:t>Nitratos</w:t>
+            </w:r>
+          </w:p>
+        </w:tc>
+        <w:tc>
+          <w:tcPr>
+            <w:tcW w:type="dxa" w:w="5669"/>
+          </w:tcPr>
+          <w:p>
+            <w:r>
+              <w:rPr>
+                <w:sz w:val="16"/>
+              </w:rPr>
+              <w:t>mg/L</w:t>
+            </w:r>
+          </w:p>
+        </w:tc>
+      </w:tr>
+      <w:tr>
+        <w:tc>
+          <w:tcPr>
+            <w:tcW w:type="dxa" w:w="3969"/>
+          </w:tcPr>
+          <w:p>
+            <w:r>
+              <w:rPr>
+                <w:sz w:val="16"/>
+              </w:rPr>
+              <w:t>Fosfatos</w:t>
+            </w:r>
+          </w:p>
+        </w:tc>
+        <w:tc>
+          <w:tcPr>
+            <w:tcW w:type="dxa" w:w="5669"/>
+          </w:tcPr>
+          <w:p>
+            <w:r>
+              <w:rPr>
+                <w:sz w:val="16"/>
+              </w:rPr>
+              <w:t>mg/L</w:t>
+            </w:r>
+          </w:p>
+        </w:tc>
+      </w:tr>
+      <w:tr>
+        <w:tc>
+          <w:tcPr>
+            <w:tcW w:type="dxa" w:w="3969"/>
+          </w:tcPr>
+          <w:p>
+            <w:r>
+              <w:rPr>
+                <w:sz w:val="16"/>
+              </w:rPr>
+              <w:t>Aceites y grasas</w:t>
+            </w:r>
+          </w:p>
+        </w:tc>
+        <w:tc>
+          <w:tcPr>
+            <w:tcW w:type="dxa" w:w="5669"/>
+          </w:tcPr>
+          <w:p>
+            <w:r>
+              <w:rPr>
+                <w:sz w:val="16"/>
+              </w:rPr>
+              <w:t>mg/L</w:t>
+            </w:r>
+          </w:p>
+        </w:tc>
+      </w:tr>
+      <w:tr>
+        <w:tc>
+          <w:tcPr>
+            <w:tcW w:type="dxa" w:w="3969"/>
+          </w:tcPr>
+          <w:p>
+            <w:r>
+              <w:rPr>
+                <w:sz w:val="16"/>
+              </w:rPr>
+              <w:t>Coliformes totales</w:t>
+            </w:r>
+          </w:p>
+        </w:tc>
+        <w:tc>
+          <w:tcPr>
+            <w:tcW w:type="dxa" w:w="5669"/>
+          </w:tcPr>
+          <w:p>
+            <w:r>
+              <w:rPr>
+                <w:sz w:val="16"/>
+              </w:rPr>
+              <w:t>NMP/100 mL</w:t>
+            </w:r>
+          </w:p>
+        </w:tc>
+      </w:tr>
+      <w:tr>
+        <w:tc>
+          <w:tcPr>
+            <w:tcW w:type="dxa" w:w="3969"/>
+          </w:tcPr>
+          <w:p>
+            <w:r>
+              <w:rPr>
+                <w:sz w:val="16"/>
+              </w:rPr>
+              <w:t>Coliformes termotolerantes</w:t>
+            </w:r>
+          </w:p>
+        </w:tc>
+        <w:tc>
+          <w:tcPr>
+            <w:tcW w:type="dxa" w:w="5669"/>
+          </w:tcPr>
+          <w:p>
+            <w:r>
+              <w:rPr>
+                <w:sz w:val="16"/>
+              </w:rPr>
+              <w:t>NMP/100 mL</w:t>
+            </w:r>
+          </w:p>
+        </w:tc>
+      </w:tr>
+      <w:tr>
+        <w:tc>
+          <w:tcPr>
+            <w:tcW w:type="dxa" w:w="3969"/>
+          </w:tcPr>
+          <w:p>
+            <w:r>
+              <w:rPr>
+                <w:sz w:val="16"/>
+              </w:rPr>
+              <w:t>Observaciones</w:t>
+            </w:r>
+          </w:p>
+        </w:tc>
+        <w:tc>
+          <w:tcPr>
+            <w:tcW w:type="dxa" w:w="5669"/>
+          </w:tcPr>
+          <w:p>
+            <w:r>
+              <w:rPr>
+                <w:sz w:val="16"/>
+              </w:rPr>
+              <w:t>texto</w:t>
+            </w:r>
+          </w:p>
+        </w:tc>
+      </w:tr>
+      <w:tr>
+        <w:tc>
+          <w:tcPr>
+            <w:tcW w:type="dxa" w:w="3969"/>
+          </w:tcPr>
+          <w:p>
+            <w:r>
+              <w:rPr>
+                <w:sz w:val="16"/>
+              </w:rPr>
+              <w:t>Responsable</w:t>
+            </w:r>
+          </w:p>
+        </w:tc>
+        <w:tc>
+          <w:tcPr>
+            <w:tcW w:type="dxa" w:w="5669"/>
+          </w:tcPr>
+          <w:p>
+            <w:r>
+              <w:rPr>
+                <w:sz w:val="16"/>
+              </w:rPr>
+              <w:t>nombre y firma</w:t>
+            </w:r>
+          </w:p>
+        </w:tc>
+      </w:tr>
+    </w:tbl>
     <w:sectPr>
       <w:headerReference r:id="rId21" w:type="default"/>
       <w:footerReference r:id="rId22" w:type="default"/>

</xml_diff>